<commit_message>
Update style guide status now all four portals are visually designed
Marks Section 8.2 as built and the document status as APPROVED,
reflecting the completed Buyer, Vendor, and Internal Operations
rollout, and points to Stage 5 (Interactive Prototype) as next.

Co-Authored-By: Claude Sonnet 5 <noreply@anthropic.com>
</commit_message>
<xml_diff>
--- a/Farm_Master_Style_Guide_Stage4.docx
+++ b/Farm_Master_Style_Guide_Stage4.docx
@@ -62,7 +62,7 @@
           <w:b w:val="0"/>
           <w:i w:val="0"/>
         </w:rPr>
-        <w:t>Status: DRAFT — Farmer Portal visual design built and attached for review (farmer_portal_visual.html); Buyer, Vendor, and Internal Operations remain Stage 3 low-fi pending sign-off on this direction, per the workflow guide's “one portal at a time.”</w:t>
+        <w:t>Status: APPROVED — Deep Green &amp; Maize Gold approved by Emmanuel as applied to the Farmer Portal (3 September 2026); the same system has since been rolled out to Buyer, Vendor, and Internal Operations using the dense treatment (Section 7). All four portals now have a Stage 4 visual design file in Stage 4 Visual Design/.</w:t>
       </w:r>
     </w:p>
     <w:p>
@@ -2311,7 +2311,7 @@
         <w:pStyle w:val="Heading2"/>
       </w:pPr>
       <w:r>
-        <w:t>8.2 Buyer / Vendor / Control Centre — Data-Dense Dashboard (not yet built)</w:t>
+        <w:t>8.2 Buyer / Vendor / Control Centre — Data-Dense Dashboard (built this stage)</w:t>
       </w:r>
     </w:p>
     <w:p>
@@ -2320,7 +2320,7 @@
           <w:b w:val="0"/>
           <w:i w:val="0"/>
         </w:rPr>
-        <w:t>Deferred until the Farmer Portal direction above is reviewed, per the workflow guide's “one portal, one stage at a time” — asking for all four portals' visual design in one pass risks reworking all four if the direction needs a correction after the first review.</w:t>
+        <w:t>Built following Farmer Portal approval: buyer_portal_visual.html and vendor_portal_visual.html apply the dense treatment uniformly. internal_operations_visual.html applies a split — the 9 office-role screens (Dashboard, Matching, Formula Builder, Visit Logs, Intake, Finance, Reporting, MoFA, User Admin) use the dense treatment, while the 3 confirmed phone-first field-role screens (Logistics Dispatch, Proof of Pickup/Delivery, Trunking) carry a visible device badge in-screen so the confirmed Control Centre split (PRD Section 5.1) is legible in the design itself, not just in documentation.</w:t>
       </w:r>
     </w:p>
     <w:p>
@@ -2337,7 +2337,7 @@
           <w:b w:val="0"/>
           <w:i w:val="0"/>
         </w:rPr>
-        <w:t>None blocking. If the Deep Green &amp; Maize Gold direction is approved as applied to the Farmer Portal, the same system rolls forward to Buyer, Vendor, and Internal Operations using the “dense” component rules in Section 7 with no further brand decisions needed.</w:t>
+        <w:t>None blocking. All four portals are now visually designed under one confirmed system. Next: Stage 5 (Interactive Prototype) wires up clickable states for the highest-stakes flows — the buyer commitment-fee payment, a farmer accepting an opportunity and receiving a production formula, and a vendor mechanisation request — per the workflow guide.</w:t>
       </w:r>
     </w:p>
     <w:sectPr>

</xml_diff>